<commit_message>
Them slide thuyet trinh va doi chieu replay muc 4
- final-project/slides: deck Slidev theo template DLP, 31 trang, 20 phut gom demo
- member4: doi chieu replay TTD/MFA voi member3 (khop), quy trinh 0.6, gop y bao cao tong hop
- shared/member4: cap nhat tai lieu va ket qua chay 19/10

Co-authored-by: Copilot <223556219+Copilot@users.noreply.github.com>
</commit_message>
<xml_diff>
--- a/final-project/member4/QUY_TRINH_THUC_NGHIEM_VO_CONG_MINH.docx
+++ b/final-project/member4/QUY_TRINH_THUC_NGHIEM_VO_CONG_MINH.docx
@@ -23,7 +23,7 @@
         <w:pStyle w:val="Normal"/>
       </w:pPr>
       <w:r>
-        <w:t xml:space="preserve">Bản nháp 0.5 - cập nhật ngày 18/10/2026</w:t>
+        <w:t xml:space="preserve">Bản nháp 0.6 - cập nhật ngày 19/10/2026</w:t>
       </w:r>
     </w:p>
     <w:p>
@@ -135,7 +135,15 @@
         <w:pStyle w:val="Normal"/>
       </w:pPr>
       <w:r>
-        <w:t xml:space="preserve">Cập nhật 18/10: đã nhận bản reviewed của phần mô hình và đối chiếu độc lập chỉ số cửa sổ cố định trên dữ liệu mô phỏng. Chi tiết nằm trong DOI_CHIEU_MEMBER3_VO_CONG_MINH.docx; chưa coi replay TTD/MFA đã nối xong hoặc các giả thuyết đã được kiểm chứng. Những định nghĩa còn mở trong tài liệu này không tự trở thành quyết định chung chỉ vì đã có mã chạy.</w:t>
+        <w:t xml:space="preserve">Cập nhật 18/10: đã nhận bản reviewed của phần mô hình và đối chiếu độc lập chỉ số cửa sổ cố định trên dữ liệu mô phỏng. Chi tiết nằm trong DOI_CHIEU_MEMBER3_VO_CONG_MINH.docx.</w:t>
+      </w:r>
+    </w:p>
+    <w:p>
+      <w:pPr>
+        <w:pStyle w:val="Normal"/>
+      </w:pPr>
+      <w:r>
+        <w:t xml:space="preserve">Cập nhật 19/10: đã đối chiếu độc lập replay có trạng thái của lần chạy simulation-2026-10-19. Toàn bộ quyết định, sự kiện, TTD, MFA/giờ và thu hồi nhầm khớp; chi tiết và định nghĩa TTD, MFA/giờ đề xuất chốt nằm trong DOI_CHIEU_REPLAY_MEMBER3_VO_CONG_MINH.docx. Các giả thuyết vẫn chưa được kiểm chứng vì dữ liệu là mô phỏng và không cấu hình nào đạt ràng buộc đặt trước.</w:t>
       </w:r>
     </w:p>
     <w:p>
@@ -247,15 +255,15 @@
         <w:pStyle w:val="Normal"/>
       </w:pPr>
       <w:r>
-        <w:t xml:space="preserve">Cập nhật member2 tại commit f0fb15c: kế hoạch thu thật mới đặt mục tiêu 20 người, bốn phiên chính thức/người qua ít nhất ba ngày: ngày 1 hai train, ngày 2 một validation, ngày 3 một test. Hai phiên train cách nhau ít nhất 30 phút từ kết thúc phiên trước đến bắt đầu phiên sau; mỗi phiên chính thức cần ít nhất 1.000 lần gõ hợp lệ và 480 giây ghi chủ động. Pilot cần 300 lần gõ và 300 giây, tách khỏi nghiên cứu chính. Đây là mục tiêu thiết kế, không phải số người/phiên đã thu được.</w:t>
-      </w:r>
-    </w:p>
-    <w:p>
-      <w:pPr>
-        <w:pStyle w:val="Normal"/>
-      </w:pPr>
-      <w:r>
-        <w:t xml:space="preserve">Thiết kế này chưa khớp phần mô hình: partitionValidation của member3 yêu cầu ít nhất hai phiên validation độc lập/người để tách hiệu chuẩn điểm và chọn ngưỡng. Lịch bốn phiên chỉ có một phiên validation nên không chạy được quy trình hiện tại. Phương án sáu phiên trong bản 0.3 là lịch cũ, không còn là mô tả hiện hành của member2. Nhóm cần thống nhất bổ sung phiên validation hoặc thiết kế lại bước hiệu chuẩn/chọn ngưỡng và sửa đồng bộ các phần; chưa tự chốt một phương án. Không chia cửa sổ của một phiên để giả làm hai phiên độc lập, không dùng test để bù validation.</w:t>
+        <w:t xml:space="preserve">Cập nhật member2 tại commit f0fb15c (đã được thay bằng thiết kế năm phiên ở đoạn dưới): kế hoạch thu thật mới đặt mục tiêu 20 người, bốn phiên chính thức/người qua ít nhất ba ngày: ngày 1 hai train, ngày 2 một validation, ngày 3 một test. Hai phiên train cách nhau ít nhất 30 phút từ kết thúc phiên trước đến bắt đầu phiên sau; mỗi phiên chính thức cần ít nhất 1.000 lần gõ hợp lệ và 480 giây ghi chủ động. Pilot cần 300 lần gõ và 300 giây, tách khỏi nghiên cứu chính. Đây là mục tiêu thiết kế, không phải số người/phiên đã thu được.</w:t>
+      </w:r>
+    </w:p>
+    <w:p>
+      <w:pPr>
+        <w:pStyle w:val="Normal"/>
+      </w:pPr>
+      <w:r>
+        <w:t xml:space="preserve">Cập nhật 19/10: phần dữ liệu đã đổi thiết kế thu thật thành năm phiên mỗi người (hai train ngày 1, hai validation ngày 2, một test ngày 3), đồng bộ protocol, validator và kiểm thử. Thiết kế này khớp yêu cầu hai phiên validation của phần mô hình: phiên validation đầu dùng hiệu chỉnh điểm, phiên sau dùng chọn ngưỡng và chính sách. Bộ dữ liệu hiện có vẫn là mô phỏng; thiết kế năm phiên áp dụng cho lần thu người thật nếu có. Không chia cửa sổ của một phiên để giả làm hai phiên độc lập, không dùng test để bù validation.</w:t>
       </w:r>
     </w:p>
     <w:p>
@@ -783,15 +791,15 @@
         <w:pStyle w:val="Normal"/>
       </w:pPr>
       <w:r>
-        <w:t xml:space="preserve">Điểm cần trao đổi trước khi thu chính thức: lịch mới của anh Phong có một phiên validation/người, còn mã anh Vũ cần ít nhất hai phiên độc lập để hiệu chuẩn và chọn ngưỡng. Hai anh xem giúp em mình bổ sung phiên hay điều chỉnh quy trình mô hình cho khớp nhé; chưa chia cửa sổ để thay phiên. Bốn lượt AI pilot hiện chỉ dùng kiểm công cụ, không tính thành bốn người tham gia.</w:t>
-      </w:r>
-    </w:p>
-    <w:p>
-      <w:pPr>
-        <w:pStyle w:val="Normal"/>
-      </w:pPr>
-      <w:r>
-        <w:t xml:space="preserve">Với phần mô hình của anh Vũ: bản reviewed đã có scorer L1/Isolation Forest và các chính sách B0/B1/P1. Em đã nối điểm cửa sổ cố định và đối chiếu khớp FAR/FRR/EER. Anh xem giúp em các điểm về mẫu số MFA, TTD và metadata replay trong mục 5 của DOI_CHIEU_MEMBER3_VO_CONG_MINH.docx nhé; phần replay chưa coi là đã khớp chỉ vì bảng cửa sổ khớp.</w:t>
+        <w:t xml:space="preserve">Về số phiên validation: anh Phong đã cập nhật thiết kế thu thật thành năm phiên mỗi người (có hai phiên validation), khớp với mô hình của anh Vũ. Bốn lượt AI pilot hiện chỉ dùng kiểm công cụ, không tính thành bốn người tham gia.</w:t>
+      </w:r>
+    </w:p>
+    <w:p>
+      <w:pPr>
+        <w:pStyle w:val="Normal"/>
+      </w:pPr>
+      <w:r>
+        <w:t xml:space="preserve">Với phần mô hình của anh Vũ: em đã đối chiếu độc lập cả điểm cửa sổ cố định và replay có trạng thái của lần chạy 19/10, tất cả đều khớp. Định nghĩa TTD và MFA/giờ em đề xuất chốt ở mục 6 của DOI_CHIEU_REPLAY_MEMBER3_VO_CONG_MINH.docx; mọi người không có ý kiến khác thì em dùng thống nhất trong báo cáo.</w:t>
       </w:r>
     </w:p>
     <w:p>
@@ -1007,7 +1015,7 @@
         <w:pStyle w:val="Normal"/>
       </w:pPr>
       <w:r>
-        <w:t xml:space="preserve">Giới hạn hiện tại: đã nối điểm cửa sổ TV3 và tính lại FAR/FRR/EER trên mô phỏng, chưa nối độc lập replay TTD/MFA. TV3 đã có ghép A1 từ strokes và ablation lambda=1, nhưng member4 chưa tái dựng/đánh giá độc lập các phần đó; chưa có kết quả người thật hoặc phân tích thời gian đến phát hiện đầy đủ khi có kiểm duyệt. Đã có kiểm thử và chặn tính nhầm khi MFA chờ xuyên qua N, nhưng cách phân loại đầy đủ các ca này còn cần thống nhất khi nối log. MFA mô phỏng không chứng minh yếu tố MFA thực tế an toàn.</w:t>
+        <w:t xml:space="preserve">Giới hạn hiện tại: đã nối điểm cửa sổ TV3 và đối chiếu độc lập cả FAR/FRR/EER lẫn replay TTD/MFA trên mô phỏng; thời lượng ghi dùng làm mẫu số MFA/giờ mới được kiểm tính nhất quán, chưa tính lại từ dữ liệu thô. TV3 đã có ghép A1 từ strokes và ablation lambda=1, nhưng member4 chưa tái dựng/đánh giá độc lập các phần đó; chưa có kết quả người thật hoặc phân tích thời gian đến phát hiện đầy đủ khi có kiểm duyệt. Đã có kiểm thử và chặn tính nhầm khi MFA chờ xuyên qua N, nhưng cách phân loại đầy đủ các ca này còn cần thống nhất khi nối log. MFA mô phỏng không chứng minh yếu tố MFA thực tế an toàn.</w:t>
       </w:r>
     </w:p>
     <w:p>

</xml_diff>